<commit_message>
feat(voice): optimize TTFA latency with Ollama VRAM keepalive & tune headphone VAD pause tolerance to 1800ms
- Add keep_alive='30m' to ollama.chat() in brain.py and 4-min heartbeat loop in main.py to eliminate 24s cold reload spikes
- Tune num_predict cap from 380 to 200 tokens for concise spoken interview turns
- Increase web pause_tolerance_ms from 1200ms to 1800ms to prevent premature cutoffs mid-sentence on headphones
- Lower _continue_rms_gate floor from 0.010 to 0.003 and continuation VAD prob from 0.20 to 0.15 for quiet headset microphones
- Synchronize current.md, tech_stack.md, and task_completion.md
</commit_message>
<xml_diff>
--- a/doc/clg_document/NETRAN AI Blackbook (2).docx
+++ b/doc/clg_document/NETRAN AI Blackbook (2).docx
@@ -8374,9 +8374,293 @@
     </w:p>
     <w:p>
       <w:pPr>
+        <w:jc w:val="both"/>
+        <w:rPr>
+          <w:sz w:val="24"/>
+          <w:szCs w:val="24"/>
+        </w:rPr>
+      </w:pPr>
+    </w:p>
+    <w:p>
+      <w:pPr>
+        <w:jc w:val="both"/>
+        <w:rPr>
+          <w:sz w:val="24"/>
+          <w:szCs w:val="24"/>
+        </w:rPr>
+      </w:pPr>
+    </w:p>
+    <w:p>
+      <w:pPr>
+        <w:pStyle w:val="Heading4"/>
+        <w:ind w:left="0" w:firstLine="0"/>
+        <w:rPr>
+          <w:u w:val="none"/>
+        </w:rPr>
+      </w:pPr>
+      <w:r>
+        <w:t>1.2</w:t>
+      </w:r>
+      <w:r>
+        <w:rPr>
+          <w:spacing w:val="61"/>
+        </w:rPr>
+        <w:t xml:space="preserve"> </w:t>
+      </w:r>
+      <w:r>
+        <w:t>Motivation</w:t>
+      </w:r>
+      <w:r>
+        <w:rPr>
+          <w:spacing w:val="-4"/>
+        </w:rPr>
+        <w:t xml:space="preserve"> </w:t>
+      </w:r>
+      <w:r>
+        <w:t>for</w:t>
+      </w:r>
+      <w:r>
+        <w:rPr>
+          <w:spacing w:val="-3"/>
+        </w:rPr>
+        <w:t xml:space="preserve"> </w:t>
+      </w:r>
+      <w:r>
+        <w:t>the</w:t>
+      </w:r>
+      <w:r>
+        <w:rPr>
+          <w:spacing w:val="-3"/>
+        </w:rPr>
+        <w:t xml:space="preserve"> </w:t>
+      </w:r>
+      <w:r>
+        <w:rPr>
+          <w:spacing w:val="-2"/>
+        </w:rPr>
+        <w:t>project</w:t>
+      </w:r>
+    </w:p>
+    <w:p>
+      <w:pPr>
         <w:pStyle w:val="BodyText"/>
-        <w:spacing w:line="360" w:lineRule="auto"/>
+        <w:rPr>
+          <w:b/>
+        </w:rPr>
+      </w:pPr>
+    </w:p>
+    <w:p>
+      <w:pPr>
         <w:jc w:val="both"/>
+        <w:rPr>
+          <w:sz w:val="24"/>
+          <w:szCs w:val="24"/>
+        </w:rPr>
+      </w:pPr>
+      <w:r>
+        <w:rPr>
+          <w:sz w:val="24"/>
+          <w:szCs w:val="24"/>
+        </w:rPr>
+        <w:t>The project was motivated by the following observations:</w:t>
+      </w:r>
+    </w:p>
+    <w:p>
+      <w:pPr>
+        <w:jc w:val="both"/>
+        <w:rPr>
+          <w:sz w:val="24"/>
+          <w:szCs w:val="24"/>
+        </w:rPr>
+      </w:pPr>
+    </w:p>
+    <w:p>
+      <w:pPr>
+        <w:pStyle w:val="ListParagraph"/>
+        <w:widowControl/>
+        <w:numPr>
+          <w:ilvl w:val="0"/>
+          <w:numId w:val="17"/>
+        </w:numPr>
+        <w:autoSpaceDE/>
+        <w:autoSpaceDN/>
+        <w:spacing w:after="160" w:line="259" w:lineRule="auto"/>
+        <w:contextualSpacing/>
+        <w:jc w:val="both"/>
+        <w:rPr>
+          <w:sz w:val="24"/>
+          <w:szCs w:val="24"/>
+        </w:rPr>
+      </w:pPr>
+      <w:r>
+        <w:rPr>
+          <w:b/>
+          <w:sz w:val="24"/>
+          <w:szCs w:val="24"/>
+        </w:rPr>
+        <w:t>Limited practice opportunities:</w:t>
+      </w:r>
+      <w:r>
+        <w:rPr>
+          <w:sz w:val="24"/>
+          <w:szCs w:val="24"/>
+        </w:rPr>
+        <w:t xml:space="preserve"> Mock interviews with mentors or peers are hard to schedule, and peers rarely have the expertise to judge technical answers.</w:t>
+      </w:r>
+    </w:p>
+    <w:p>
+      <w:pPr>
+        <w:pStyle w:val="ListParagraph"/>
+        <w:widowControl/>
+        <w:numPr>
+          <w:ilvl w:val="0"/>
+          <w:numId w:val="17"/>
+        </w:numPr>
+        <w:autoSpaceDE/>
+        <w:autoSpaceDN/>
+        <w:spacing w:after="160" w:line="259" w:lineRule="auto"/>
+        <w:contextualSpacing/>
+        <w:jc w:val="both"/>
+        <w:rPr>
+          <w:sz w:val="24"/>
+          <w:szCs w:val="24"/>
+        </w:rPr>
+      </w:pPr>
+      <w:r>
+        <w:rPr>
+          <w:b/>
+          <w:sz w:val="24"/>
+          <w:szCs w:val="24"/>
+        </w:rPr>
+        <w:t>Inconsistent evaluation:</w:t>
+      </w:r>
+      <w:r>
+        <w:rPr>
+          <w:sz w:val="24"/>
+          <w:szCs w:val="24"/>
+        </w:rPr>
+        <w:t xml:space="preserve"> Two human interviewers can score the same answer very differently. A system that applies one rubric to every candidate improves consistency.</w:t>
+      </w:r>
+    </w:p>
+    <w:p>
+      <w:pPr>
+        <w:pStyle w:val="ListParagraph"/>
+        <w:widowControl/>
+        <w:numPr>
+          <w:ilvl w:val="0"/>
+          <w:numId w:val="17"/>
+        </w:numPr>
+        <w:autoSpaceDE/>
+        <w:autoSpaceDN/>
+        <w:spacing w:after="160" w:line="259" w:lineRule="auto"/>
+        <w:contextualSpacing/>
+        <w:jc w:val="both"/>
+        <w:rPr>
+          <w:sz w:val="24"/>
+          <w:szCs w:val="24"/>
+        </w:rPr>
+      </w:pPr>
+      <w:r>
+        <w:rPr>
+          <w:b/>
+          <w:sz w:val="24"/>
+          <w:szCs w:val="24"/>
+        </w:rPr>
+        <w:t>Generic question banks:</w:t>
+      </w:r>
+      <w:r>
+        <w:rPr>
+          <w:sz w:val="24"/>
+          <w:szCs w:val="24"/>
+        </w:rPr>
+        <w:t xml:space="preserve"> Static lists of questions ignore the specific role, company and skills the candidate is actually applying for.</w:t>
+      </w:r>
+    </w:p>
+    <w:p>
+      <w:pPr>
+        <w:pStyle w:val="ListParagraph"/>
+        <w:widowControl/>
+        <w:numPr>
+          <w:ilvl w:val="0"/>
+          <w:numId w:val="17"/>
+        </w:numPr>
+        <w:autoSpaceDE/>
+        <w:autoSpaceDN/>
+        <w:spacing w:after="160" w:line="259" w:lineRule="auto"/>
+        <w:contextualSpacing/>
+        <w:jc w:val="both"/>
+        <w:rPr>
+          <w:sz w:val="24"/>
+          <w:szCs w:val="24"/>
+        </w:rPr>
+      </w:pPr>
+      <w:r>
+        <w:rPr>
+          <w:b/>
+          <w:sz w:val="24"/>
+          <w:szCs w:val="24"/>
+        </w:rPr>
+        <w:t>Voice is the real test:</w:t>
+      </w:r>
+      <w:r>
+        <w:rPr>
+          <w:sz w:val="24"/>
+          <w:szCs w:val="24"/>
+        </w:rPr>
+        <w:t xml:space="preserve"> Written practice does not train pacing, hesitation or confidence, which are exactly the qualities interviewers notice in a live conversation.</w:t>
+      </w:r>
+    </w:p>
+    <w:p>
+      <w:pPr>
+        <w:pStyle w:val="ListParagraph"/>
+        <w:widowControl/>
+        <w:numPr>
+          <w:ilvl w:val="0"/>
+          <w:numId w:val="17"/>
+        </w:numPr>
+        <w:autoSpaceDE/>
+        <w:autoSpaceDN/>
+        <w:spacing w:after="160" w:line="259" w:lineRule="auto"/>
+        <w:contextualSpacing/>
+        <w:jc w:val="both"/>
+        <w:rPr>
+          <w:sz w:val="24"/>
+          <w:szCs w:val="24"/>
+        </w:rPr>
+      </w:pPr>
+      <w:r>
+        <w:rPr>
+          <w:b/>
+          <w:sz w:val="24"/>
+          <w:szCs w:val="24"/>
+        </w:rPr>
+        <w:t>Privacy and cost:</w:t>
+      </w:r>
+      <w:r>
+        <w:rPr>
+          <w:sz w:val="24"/>
+          <w:szCs w:val="24"/>
+        </w:rPr>
+        <w:t xml:space="preserve"> Sending every second of candidate audio to a cloud service raises privacy concerns and recurring costs. Running speech recognition, dialogue and synthesis locally addresses both.</w:t>
+      </w:r>
+    </w:p>
+    <w:p>
+      <w:pPr>
+        <w:pStyle w:val="ListParagraph"/>
+        <w:widowControl/>
+        <w:numPr>
+          <w:ilvl w:val="0"/>
+          <w:numId w:val="17"/>
+        </w:numPr>
+        <w:autoSpaceDE/>
+        <w:autoSpaceDN/>
+        <w:spacing w:after="160" w:line="259" w:lineRule="auto"/>
+        <w:contextualSpacing/>
+        <w:jc w:val="both"/>
+        <w:rPr>
+          <w:sz w:val="24"/>
+          <w:szCs w:val="24"/>
+        </w:rPr>
         <w:sectPr>
           <w:pgSz w:w="12240" w:h="15840"/>
           <w:pgMar w:top="1380" w:right="1080" w:bottom="1040" w:left="1440" w:header="0" w:footer="809" w:gutter="0"/>
@@ -8389,91 +8673,272 @@
           <w:cols w:space="720"/>
         </w:sectPr>
       </w:pPr>
-    </w:p>
-    <w:p>
-      <w:pPr>
-        <w:pStyle w:val="Heading4"/>
-        <w:ind w:left="0" w:firstLine="0"/>
-        <w:rPr>
-          <w:u w:val="none"/>
-        </w:rPr>
-      </w:pPr>
-      <w:r>
-        <w:lastRenderedPageBreak/>
-        <w:t>1.2</w:t>
-      </w:r>
-      <w:r>
-        <w:rPr>
-          <w:spacing w:val="61"/>
-        </w:rPr>
-        <w:t xml:space="preserve"> </w:t>
-      </w:r>
-      <w:r>
-        <w:t>Motivation</w:t>
-      </w:r>
-      <w:r>
-        <w:rPr>
-          <w:spacing w:val="-4"/>
-        </w:rPr>
-        <w:t xml:space="preserve"> </w:t>
-      </w:r>
-      <w:r>
-        <w:t>for</w:t>
-      </w:r>
-      <w:r>
-        <w:rPr>
-          <w:spacing w:val="-3"/>
-        </w:rPr>
-        <w:t xml:space="preserve"> </w:t>
-      </w:r>
-      <w:r>
-        <w:t>the</w:t>
-      </w:r>
-      <w:r>
-        <w:rPr>
-          <w:spacing w:val="-3"/>
-        </w:rPr>
-        <w:t xml:space="preserve"> </w:t>
-      </w:r>
-      <w:r>
-        <w:rPr>
-          <w:spacing w:val="-2"/>
-        </w:rPr>
-        <w:t>project</w:t>
-      </w:r>
-    </w:p>
-    <w:p>
-      <w:pPr>
-        <w:pStyle w:val="BodyText"/>
+      <w:r>
         <w:rPr>
           <w:b/>
-        </w:rPr>
-      </w:pPr>
-    </w:p>
-    <w:p>
-      <w:pPr>
-        <w:jc w:val="both"/>
-        <w:rPr>
           <w:sz w:val="24"/>
           <w:szCs w:val="24"/>
         </w:rPr>
-      </w:pPr>
+        <w:t>Maturity of open models:</w:t>
+      </w:r>
       <w:r>
         <w:rPr>
           <w:sz w:val="24"/>
           <w:szCs w:val="24"/>
         </w:rPr>
-        <w:t>The project was motivated by the following observations:</w:t>
-      </w:r>
-    </w:p>
-    <w:p>
-      <w:pPr>
-        <w:jc w:val="both"/>
+        <w:t xml:space="preserve"> Open models such as Faster-Whisper, </w:t>
+      </w:r>
+      <w:proofErr w:type="spellStart"/>
+      <w:r>
         <w:rPr>
           <w:sz w:val="24"/>
           <w:szCs w:val="24"/>
         </w:rPr>
-      </w:pPr>
+        <w:t>Silero</w:t>
+      </w:r>
+      <w:proofErr w:type="spellEnd"/>
+      <w:r>
+        <w:rPr>
+          <w:sz w:val="24"/>
+          <w:szCs w:val="24"/>
+        </w:rPr>
+        <w:t xml:space="preserve"> VAD, Kokoro-82M and Qwen 2.5 now run in real time on consumer hardware</w:t>
+      </w:r>
+    </w:p>
+    <w:p>
+      <w:pPr>
+        <w:pStyle w:val="BodyText"/>
+        <w:spacing w:before="56"/>
+        <w:rPr>
+          <w:b/>
+        </w:rPr>
+      </w:pPr>
+    </w:p>
+    <w:p>
+      <w:pPr>
+        <w:pStyle w:val="Heading4"/>
+        <w:numPr>
+          <w:ilvl w:val="1"/>
+          <w:numId w:val="16"/>
+        </w:numPr>
+        <w:tabs>
+          <w:tab w:val="left" w:pos="491"/>
+        </w:tabs>
+        <w:spacing w:before="1"/>
+        <w:ind w:left="491" w:hanging="421"/>
+        <w:jc w:val="both"/>
+        <w:rPr>
+          <w:u w:val="none"/>
+        </w:rPr>
+      </w:pPr>
+      <w:r>
+        <w:t>Problem</w:t>
+      </w:r>
+      <w:r>
+        <w:rPr>
+          <w:spacing w:val="-5"/>
+        </w:rPr>
+        <w:t xml:space="preserve"> </w:t>
+      </w:r>
+      <w:r>
+        <w:rPr>
+          <w:spacing w:val="-2"/>
+        </w:rPr>
+        <w:t>Definition</w:t>
+      </w:r>
+    </w:p>
+    <w:p>
+      <w:pPr>
+        <w:pStyle w:val="BodyText"/>
+        <w:rPr>
+          <w:b/>
+        </w:rPr>
+      </w:pPr>
+    </w:p>
+    <w:p>
+      <w:r>
+        <w:t xml:space="preserve">To design and implement an autonomous, real-time, voice-to-voice technical interviewer that, given a resume and a job description, conducts a </w:t>
+      </w:r>
+      <w:proofErr w:type="spellStart"/>
+      <w:r>
+        <w:t>personalised</w:t>
+      </w:r>
+      <w:proofErr w:type="spellEnd"/>
+      <w:r>
+        <w:t xml:space="preserve"> and adaptive spoken interview and generates an objective multimodal evaluation report, while keeping conversational latency low enough to feel natural.</w:t>
+      </w:r>
+    </w:p>
+    <w:p/>
+    <w:p>
+      <w:r>
+        <w:rPr>
+          <w:b/>
+        </w:rPr>
+        <w:t>Objectives</w:t>
+      </w:r>
+    </w:p>
+    <w:p>
+      <w:pPr>
+        <w:pStyle w:val="ListParagraph"/>
+        <w:widowControl/>
+        <w:numPr>
+          <w:ilvl w:val="0"/>
+          <w:numId w:val="18"/>
+        </w:numPr>
+        <w:autoSpaceDE/>
+        <w:autoSpaceDN/>
+        <w:spacing w:after="160" w:line="259" w:lineRule="auto"/>
+        <w:contextualSpacing/>
+      </w:pPr>
+      <w:r>
+        <w:t>To extract structured profiles from a candidate resume and a job description.</w:t>
+      </w:r>
+    </w:p>
+    <w:p>
+      <w:pPr>
+        <w:pStyle w:val="ListParagraph"/>
+        <w:widowControl/>
+        <w:numPr>
+          <w:ilvl w:val="0"/>
+          <w:numId w:val="18"/>
+        </w:numPr>
+        <w:autoSpaceDE/>
+        <w:autoSpaceDN/>
+        <w:spacing w:after="160" w:line="259" w:lineRule="auto"/>
+        <w:contextualSpacing/>
+      </w:pPr>
+      <w:r>
+        <w:t>To research current market expectations for the target role and convert them into an interview rubric.</w:t>
+      </w:r>
+    </w:p>
+    <w:p>
+      <w:pPr>
+        <w:pStyle w:val="ListParagraph"/>
+        <w:widowControl/>
+        <w:numPr>
+          <w:ilvl w:val="0"/>
+          <w:numId w:val="18"/>
+        </w:numPr>
+        <w:autoSpaceDE/>
+        <w:autoSpaceDN/>
+        <w:spacing w:after="160" w:line="259" w:lineRule="auto"/>
+        <w:contextualSpacing/>
+      </w:pPr>
+      <w:r>
+        <w:t>To generate a 15-question contextual question tree with strong and weak follow-up branches.</w:t>
+      </w:r>
+    </w:p>
+    <w:p>
+      <w:pPr>
+        <w:pStyle w:val="ListParagraph"/>
+        <w:widowControl/>
+        <w:numPr>
+          <w:ilvl w:val="0"/>
+          <w:numId w:val="18"/>
+        </w:numPr>
+        <w:autoSpaceDE/>
+        <w:autoSpaceDN/>
+        <w:spacing w:after="160" w:line="259" w:lineRule="auto"/>
+        <w:contextualSpacing/>
+      </w:pPr>
+      <w:r>
+        <w:t>To build a full-duplex voice loop with low time-to-first-audio and correct turn-taking, including barge-in handling.</w:t>
+      </w:r>
+    </w:p>
+    <w:p>
+      <w:pPr>
+        <w:pStyle w:val="ListParagraph"/>
+        <w:widowControl/>
+        <w:numPr>
+          <w:ilvl w:val="0"/>
+          <w:numId w:val="18"/>
+        </w:numPr>
+        <w:autoSpaceDE/>
+        <w:autoSpaceDN/>
+        <w:spacing w:after="160" w:line="259" w:lineRule="auto"/>
+        <w:contextualSpacing/>
+      </w:pPr>
+      <w:r>
+        <w:t>To verify the speaker's identity during the session.</w:t>
+      </w:r>
+    </w:p>
+    <w:p>
+      <w:pPr>
+        <w:pStyle w:val="ListParagraph"/>
+        <w:widowControl/>
+        <w:numPr>
+          <w:ilvl w:val="0"/>
+          <w:numId w:val="18"/>
+        </w:numPr>
+        <w:autoSpaceDE/>
+        <w:autoSpaceDN/>
+        <w:spacing w:after="160" w:line="259" w:lineRule="auto"/>
+        <w:contextualSpacing/>
+      </w:pPr>
+      <w:r>
+        <w:t>To evaluate each answer for content and for delivery (pace, pauses, hesitation) and produce a scorecard.</w:t>
+      </w:r>
+    </w:p>
+    <w:p>
+      <w:pPr>
+        <w:pStyle w:val="ListParagraph"/>
+        <w:widowControl/>
+        <w:numPr>
+          <w:ilvl w:val="0"/>
+          <w:numId w:val="18"/>
+        </w:numPr>
+        <w:autoSpaceDE/>
+        <w:autoSpaceDN/>
+        <w:spacing w:after="160" w:line="259" w:lineRule="auto"/>
+        <w:contextualSpacing/>
+      </w:pPr>
+      <w:r>
+        <w:t>To deliver the system as a secure web application with history and analytics, in addition to a desktop client and a headless test harness.</w:t>
+      </w:r>
+    </w:p>
+    <w:p>
+      <w:r>
+        <w:rPr>
+          <w:b/>
+        </w:rPr>
+        <w:t>Scope:</w:t>
+      </w:r>
+      <w:r>
+        <w:t xml:space="preserve"> English-language technical interviews for software and data roles, delivered through a web browser, with the voice pipeline running on a local machine with a GPU-capable or sufficiently powerful CPU.</w:t>
+      </w:r>
+    </w:p>
+    <w:p>
+      <w:pPr>
+        <w:pStyle w:val="BodyText"/>
+        <w:spacing w:before="138"/>
+      </w:pPr>
+    </w:p>
+    <w:p>
+      <w:pPr>
+        <w:pStyle w:val="Heading4"/>
+        <w:numPr>
+          <w:ilvl w:val="1"/>
+          <w:numId w:val="16"/>
+        </w:numPr>
+        <w:tabs>
+          <w:tab w:val="left" w:pos="491"/>
+        </w:tabs>
+        <w:spacing w:before="1"/>
+        <w:ind w:left="491" w:hanging="421"/>
+        <w:jc w:val="both"/>
+        <w:rPr>
+          <w:u w:val="none"/>
+        </w:rPr>
+      </w:pPr>
+      <w:r>
+        <w:t>Existing</w:t>
+      </w:r>
+      <w:r>
+        <w:rPr>
+          <w:spacing w:val="-2"/>
+        </w:rPr>
+        <w:t xml:space="preserve"> Systems</w:t>
+      </w:r>
     </w:p>
     <w:p>
       <w:pPr>
@@ -8499,14 +8964,32 @@
           <w:sz w:val="24"/>
           <w:szCs w:val="24"/>
         </w:rPr>
-        <w:t>Limited practice opportunities:</w:t>
-      </w:r>
-      <w:r>
-        <w:rPr>
+        <w:t xml:space="preserve">Human mock-interview services (for example </w:t>
+      </w:r>
+      <w:proofErr w:type="spellStart"/>
+      <w:r>
+        <w:rPr>
+          <w:b/>
           <w:sz w:val="24"/>
           <w:szCs w:val="24"/>
         </w:rPr>
-        <w:t xml:space="preserve"> Mock interviews with mentors or peers are hard to schedule, and peers rarely have the expertise to judge technical answers.</w:t>
+        <w:t>Pramp</w:t>
+      </w:r>
+      <w:proofErr w:type="spellEnd"/>
+      <w:r>
+        <w:rPr>
+          <w:b/>
+          <w:sz w:val="24"/>
+          <w:szCs w:val="24"/>
+        </w:rPr>
+        <w:t xml:space="preserve"> and interviewing.io):</w:t>
+      </w:r>
+      <w:r>
+        <w:rPr>
+          <w:sz w:val="24"/>
+          <w:szCs w:val="24"/>
+        </w:rPr>
+        <w:t xml:space="preserve"> Connect candidates with peers or professional engineers for live practice. They give realistic feedback but depend on scheduling and availability of people.</w:t>
       </w:r>
     </w:p>
     <w:p>
@@ -8533,14 +9016,32 @@
           <w:sz w:val="24"/>
           <w:szCs w:val="24"/>
         </w:rPr>
-        <w:t>Inconsistent evaluation:</w:t>
-      </w:r>
-      <w:r>
-        <w:rPr>
+        <w:t xml:space="preserve">Asynchronous video interview platforms (for example </w:t>
+      </w:r>
+      <w:proofErr w:type="spellStart"/>
+      <w:r>
+        <w:rPr>
+          <w:b/>
           <w:sz w:val="24"/>
           <w:szCs w:val="24"/>
         </w:rPr>
-        <w:t xml:space="preserve"> Two human interviewers can score the same answer very differently. A system that applies one rubric to every candidate improves consistency.</w:t>
+        <w:t>HireVue</w:t>
+      </w:r>
+      <w:proofErr w:type="spellEnd"/>
+      <w:r>
+        <w:rPr>
+          <w:b/>
+          <w:sz w:val="24"/>
+          <w:szCs w:val="24"/>
+        </w:rPr>
+        <w:t>):</w:t>
+      </w:r>
+      <w:r>
+        <w:rPr>
+          <w:sz w:val="24"/>
+          <w:szCs w:val="24"/>
+        </w:rPr>
+        <w:t xml:space="preserve"> Candidates record answers to fixed prompts, and employers review or score them. They are built for recruiters rather than for candidate learning.</w:t>
       </w:r>
     </w:p>
     <w:p>
@@ -8567,14 +9068,14 @@
           <w:sz w:val="24"/>
           <w:szCs w:val="24"/>
         </w:rPr>
-        <w:t>Generic question banks:</w:t>
+        <w:t>Practice tools from large vendors (for example Google Interview Warmup):</w:t>
       </w:r>
       <w:r>
         <w:rPr>
           <w:sz w:val="24"/>
           <w:szCs w:val="24"/>
         </w:rPr>
-        <w:t xml:space="preserve"> Static lists of questions ignore the specific role, company and skills the candidate is actually applying for.</w:t>
+        <w:t xml:space="preserve"> Present questions, transcribe spoken answers and give general insights, but the question set is generic and the interaction is not a free-flowing conversation.</w:t>
       </w:r>
     </w:p>
     <w:p>
@@ -8601,14 +9102,14 @@
           <w:sz w:val="24"/>
           <w:szCs w:val="24"/>
         </w:rPr>
-        <w:t>Voice is the real test:</w:t>
+        <w:t>Text chatbots built on general LLMs:</w:t>
       </w:r>
       <w:r>
         <w:rPr>
           <w:sz w:val="24"/>
           <w:szCs w:val="24"/>
         </w:rPr>
-        <w:t xml:space="preserve"> Written practice does not train pacing, hesitation or confidence, which are exactly the qualities interviewers notice in a live conversation.</w:t>
+        <w:t xml:space="preserve"> Can simulate an interviewer in chat, but have no voice, no acoustic analysis and no structured scoring.</w:t>
       </w:r>
     </w:p>
     <w:p>
@@ -8635,622 +9136,21 @@
           <w:sz w:val="24"/>
           <w:szCs w:val="24"/>
         </w:rPr>
-        <w:t>Privacy and cost:</w:t>
+        <w:t>Cloud voice assistants and voice-agent APIs:</w:t>
       </w:r>
       <w:r>
         <w:rPr>
           <w:sz w:val="24"/>
           <w:szCs w:val="24"/>
         </w:rPr>
-        <w:t xml:space="preserve"> Sending every second of candidate audio to a cloud service raises privacy concerns and recurring costs. Running speech recognition, dialogue and synthesis locally addresses both.</w:t>
-      </w:r>
-    </w:p>
-    <w:p>
-      <w:pPr>
-        <w:pStyle w:val="ListParagraph"/>
-        <w:widowControl/>
-        <w:numPr>
-          <w:ilvl w:val="0"/>
-          <w:numId w:val="17"/>
-        </w:numPr>
-        <w:autoSpaceDE/>
-        <w:autoSpaceDN/>
-        <w:spacing w:after="160" w:line="259" w:lineRule="auto"/>
-        <w:contextualSpacing/>
-        <w:jc w:val="both"/>
-        <w:rPr>
-          <w:sz w:val="24"/>
-          <w:szCs w:val="24"/>
-        </w:rPr>
-      </w:pPr>
-      <w:r>
-        <w:rPr>
-          <w:b/>
-          <w:sz w:val="24"/>
-          <w:szCs w:val="24"/>
-        </w:rPr>
-        <w:t>Maturity of open models:</w:t>
-      </w:r>
-      <w:r>
-        <w:rPr>
-          <w:sz w:val="24"/>
-          <w:szCs w:val="24"/>
-        </w:rPr>
-        <w:t xml:space="preserve"> Open models such as Faster-Whisper, </w:t>
-      </w:r>
-      <w:proofErr w:type="spellStart"/>
-      <w:r>
-        <w:rPr>
-          <w:sz w:val="24"/>
-          <w:szCs w:val="24"/>
-        </w:rPr>
-        <w:t>Silero</w:t>
-      </w:r>
-      <w:proofErr w:type="spellEnd"/>
-      <w:r>
-        <w:rPr>
-          <w:sz w:val="24"/>
-          <w:szCs w:val="24"/>
-        </w:rPr>
-        <w:t xml:space="preserve"> VAD, Kokoro-82M and Qwen 2.5 now run in real time on consumer hardware.</w:t>
-      </w:r>
-    </w:p>
-    <w:p>
-      <w:pPr>
-        <w:widowControl/>
-        <w:autoSpaceDE/>
-        <w:autoSpaceDN/>
-        <w:spacing w:after="160" w:line="259" w:lineRule="auto"/>
-        <w:contextualSpacing/>
-        <w:jc w:val="both"/>
-        <w:rPr>
-          <w:sz w:val="24"/>
-          <w:szCs w:val="24"/>
-        </w:rPr>
-      </w:pPr>
-    </w:p>
-    <w:p>
-      <w:pPr>
-        <w:widowControl/>
-        <w:autoSpaceDE/>
-        <w:autoSpaceDN/>
-        <w:spacing w:after="160" w:line="259" w:lineRule="auto"/>
-        <w:contextualSpacing/>
-        <w:jc w:val="both"/>
-        <w:rPr>
-          <w:sz w:val="24"/>
-          <w:szCs w:val="24"/>
-        </w:rPr>
-      </w:pPr>
-    </w:p>
-    <w:p>
-      <w:pPr>
-        <w:widowControl/>
-        <w:autoSpaceDE/>
-        <w:autoSpaceDN/>
-        <w:spacing w:after="160" w:line="259" w:lineRule="auto"/>
-        <w:contextualSpacing/>
-        <w:jc w:val="both"/>
-        <w:rPr>
-          <w:sz w:val="24"/>
-          <w:szCs w:val="24"/>
-        </w:rPr>
-      </w:pPr>
-    </w:p>
-    <w:p>
-      <w:pPr>
-        <w:pStyle w:val="BodyText"/>
-        <w:spacing w:before="56"/>
-        <w:rPr>
-          <w:b/>
-        </w:rPr>
-      </w:pPr>
-    </w:p>
-    <w:p>
-      <w:pPr>
-        <w:pStyle w:val="Heading4"/>
-        <w:numPr>
-          <w:ilvl w:val="1"/>
-          <w:numId w:val="16"/>
-        </w:numPr>
-        <w:tabs>
-          <w:tab w:val="left" w:pos="491"/>
-        </w:tabs>
-        <w:spacing w:before="1"/>
-        <w:ind w:left="491" w:hanging="421"/>
-        <w:jc w:val="both"/>
-        <w:rPr>
-          <w:u w:val="none"/>
-        </w:rPr>
-      </w:pPr>
-      <w:r>
-        <w:t>Problem</w:t>
-      </w:r>
-      <w:r>
-        <w:rPr>
-          <w:spacing w:val="-5"/>
-        </w:rPr>
-        <w:t xml:space="preserve"> </w:t>
-      </w:r>
-      <w:r>
-        <w:rPr>
-          <w:spacing w:val="-2"/>
-        </w:rPr>
-        <w:t>Definition</w:t>
-      </w:r>
-    </w:p>
-    <w:p>
-      <w:pPr>
-        <w:pStyle w:val="BodyText"/>
-        <w:rPr>
-          <w:b/>
-        </w:rPr>
-      </w:pPr>
-    </w:p>
-    <w:p>
-      <w:r>
-        <w:t xml:space="preserve">To design and implement an autonomous, real-time, voice-to-voice technical interviewer that, given a resume and a job description, conducts a </w:t>
-      </w:r>
-      <w:proofErr w:type="spellStart"/>
-      <w:r>
-        <w:t>personalised</w:t>
-      </w:r>
-      <w:proofErr w:type="spellEnd"/>
-      <w:r>
-        <w:t xml:space="preserve"> and adaptive spoken interview and generates an objective multimodal evaluation report, while keeping conversational latency low enough to feel natural.</w:t>
-      </w:r>
-    </w:p>
-    <w:p/>
-    <w:p>
-      <w:r>
-        <w:rPr>
-          <w:b/>
-        </w:rPr>
-        <w:t>Objectives</w:t>
-      </w:r>
-    </w:p>
-    <w:p>
-      <w:pPr>
-        <w:pStyle w:val="ListParagraph"/>
-        <w:widowControl/>
-        <w:numPr>
-          <w:ilvl w:val="0"/>
-          <w:numId w:val="18"/>
-        </w:numPr>
-        <w:autoSpaceDE/>
-        <w:autoSpaceDN/>
-        <w:spacing w:after="160" w:line="259" w:lineRule="auto"/>
-        <w:contextualSpacing/>
-      </w:pPr>
-      <w:r>
-        <w:t>To extract structured profiles from a candidate resume and a job description.</w:t>
-      </w:r>
-    </w:p>
-    <w:p>
-      <w:pPr>
-        <w:pStyle w:val="ListParagraph"/>
-        <w:widowControl/>
-        <w:numPr>
-          <w:ilvl w:val="0"/>
-          <w:numId w:val="18"/>
-        </w:numPr>
-        <w:autoSpaceDE/>
-        <w:autoSpaceDN/>
-        <w:spacing w:after="160" w:line="259" w:lineRule="auto"/>
-        <w:contextualSpacing/>
-      </w:pPr>
-      <w:r>
-        <w:t>To research current market expectations for the target role and convert them into an interview rubric.</w:t>
-      </w:r>
-    </w:p>
-    <w:p>
-      <w:pPr>
-        <w:pStyle w:val="ListParagraph"/>
-        <w:widowControl/>
-        <w:numPr>
-          <w:ilvl w:val="0"/>
-          <w:numId w:val="18"/>
-        </w:numPr>
-        <w:autoSpaceDE/>
-        <w:autoSpaceDN/>
-        <w:spacing w:after="160" w:line="259" w:lineRule="auto"/>
-        <w:contextualSpacing/>
-      </w:pPr>
-      <w:r>
-        <w:t>To generate a 15-question contextual question tree with strong and weak follow-up branches.</w:t>
-      </w:r>
-    </w:p>
-    <w:p>
-      <w:pPr>
-        <w:pStyle w:val="ListParagraph"/>
-        <w:widowControl/>
-        <w:numPr>
-          <w:ilvl w:val="0"/>
-          <w:numId w:val="18"/>
-        </w:numPr>
-        <w:autoSpaceDE/>
-        <w:autoSpaceDN/>
-        <w:spacing w:after="160" w:line="259" w:lineRule="auto"/>
-        <w:contextualSpacing/>
-      </w:pPr>
-      <w:r>
-        <w:t>To build a full-duplex voice loop with low time-to-first-audio and correct turn-taking, including barge-in handling.</w:t>
-      </w:r>
-    </w:p>
-    <w:p>
-      <w:pPr>
-        <w:pStyle w:val="ListParagraph"/>
-        <w:widowControl/>
-        <w:numPr>
-          <w:ilvl w:val="0"/>
-          <w:numId w:val="18"/>
-        </w:numPr>
-        <w:autoSpaceDE/>
-        <w:autoSpaceDN/>
-        <w:spacing w:after="160" w:line="259" w:lineRule="auto"/>
-        <w:contextualSpacing/>
-      </w:pPr>
-      <w:r>
-        <w:t>To verify the speaker's identity during the session.</w:t>
-      </w:r>
-    </w:p>
-    <w:p>
-      <w:pPr>
-        <w:pStyle w:val="ListParagraph"/>
-        <w:widowControl/>
-        <w:numPr>
-          <w:ilvl w:val="0"/>
-          <w:numId w:val="18"/>
-        </w:numPr>
-        <w:autoSpaceDE/>
-        <w:autoSpaceDN/>
-        <w:spacing w:after="160" w:line="259" w:lineRule="auto"/>
-        <w:contextualSpacing/>
-      </w:pPr>
-      <w:r>
-        <w:t>To evaluate each answer for content and for delivery (pace, pauses, hesitation) and produce a scorecard.</w:t>
-      </w:r>
-    </w:p>
-    <w:p>
-      <w:pPr>
-        <w:pStyle w:val="ListParagraph"/>
-        <w:widowControl/>
-        <w:numPr>
-          <w:ilvl w:val="0"/>
-          <w:numId w:val="18"/>
-        </w:numPr>
-        <w:autoSpaceDE/>
-        <w:autoSpaceDN/>
-        <w:spacing w:after="160" w:line="259" w:lineRule="auto"/>
-        <w:contextualSpacing/>
-      </w:pPr>
-      <w:r>
-        <w:t>To deliver the system as a secure web application with history and analytics, in addition to a desktop client and a headless test harness.</w:t>
-      </w:r>
-    </w:p>
-    <w:p>
-      <w:r>
-        <w:rPr>
-          <w:b/>
-        </w:rPr>
-        <w:t>Scope:</w:t>
-      </w:r>
-      <w:r>
-        <w:t xml:space="preserve"> English-language technical interviews for software and data roles, delivered through a web browser, with the voice pipeline running on a local machine with a GPU-capable or sufficiently powerful CPU.</w:t>
-      </w:r>
-    </w:p>
-    <w:p>
-      <w:pPr>
-        <w:pStyle w:val="BodyText"/>
-        <w:spacing w:before="138"/>
-      </w:pPr>
-    </w:p>
-    <w:p>
-      <w:pPr>
-        <w:pStyle w:val="BodyText"/>
-        <w:spacing w:before="138"/>
-      </w:pPr>
-    </w:p>
-    <w:p>
-      <w:pPr>
-        <w:pStyle w:val="BodyText"/>
-        <w:spacing w:before="138"/>
-      </w:pPr>
-    </w:p>
-    <w:p>
-      <w:pPr>
-        <w:pStyle w:val="BodyText"/>
-        <w:spacing w:before="138"/>
-      </w:pPr>
-    </w:p>
-    <w:p>
-      <w:pPr>
-        <w:pStyle w:val="BodyText"/>
-        <w:spacing w:before="138"/>
-      </w:pPr>
-    </w:p>
-    <w:p>
-      <w:pPr>
-        <w:pStyle w:val="BodyText"/>
-        <w:spacing w:before="138"/>
-      </w:pPr>
-    </w:p>
-    <w:p>
-      <w:pPr>
-        <w:pStyle w:val="Heading4"/>
-        <w:numPr>
-          <w:ilvl w:val="1"/>
-          <w:numId w:val="16"/>
-        </w:numPr>
-        <w:tabs>
-          <w:tab w:val="left" w:pos="491"/>
-        </w:tabs>
-        <w:spacing w:before="1"/>
-        <w:ind w:left="491" w:hanging="421"/>
-        <w:jc w:val="both"/>
-        <w:rPr>
-          <w:u w:val="none"/>
-        </w:rPr>
-      </w:pPr>
-      <w:r>
-        <w:rPr>
-          <w:spacing w:val="-3"/>
-        </w:rPr>
-        <w:t xml:space="preserve"> </w:t>
-      </w:r>
-      <w:r>
-        <w:t>Existing</w:t>
-      </w:r>
-      <w:r>
-        <w:rPr>
-          <w:spacing w:val="-2"/>
-        </w:rPr>
-        <w:t xml:space="preserve"> Systems</w:t>
-      </w:r>
-    </w:p>
-    <w:p>
-      <w:pPr>
-        <w:pStyle w:val="ListParagraph"/>
-        <w:spacing w:line="360" w:lineRule="auto"/>
-        <w:jc w:val="both"/>
-        <w:rPr>
-          <w:b/>
-          <w:color w:val="0D0D0D"/>
-          <w:sz w:val="24"/>
-          <w:szCs w:val="24"/>
-        </w:rPr>
-      </w:pPr>
-    </w:p>
-    <w:p>
-      <w:pPr>
-        <w:pStyle w:val="ListParagraph"/>
-        <w:widowControl/>
-        <w:numPr>
-          <w:ilvl w:val="0"/>
-          <w:numId w:val="17"/>
-        </w:numPr>
-        <w:autoSpaceDE/>
-        <w:autoSpaceDN/>
-        <w:spacing w:after="160" w:line="259" w:lineRule="auto"/>
-        <w:contextualSpacing/>
-        <w:jc w:val="both"/>
-        <w:rPr>
-          <w:sz w:val="24"/>
-          <w:szCs w:val="24"/>
-        </w:rPr>
-      </w:pPr>
-      <w:r>
-        <w:rPr>
-          <w:b/>
-          <w:sz w:val="24"/>
-          <w:szCs w:val="24"/>
-        </w:rPr>
-        <w:t xml:space="preserve">Human mock-interview services (for example </w:t>
-      </w:r>
-      <w:proofErr w:type="spellStart"/>
-      <w:r>
-        <w:rPr>
-          <w:b/>
-          <w:sz w:val="24"/>
-          <w:szCs w:val="24"/>
-        </w:rPr>
-        <w:t>Pramp</w:t>
-      </w:r>
-      <w:proofErr w:type="spellEnd"/>
-      <w:r>
-        <w:rPr>
-          <w:b/>
-          <w:sz w:val="24"/>
-          <w:szCs w:val="24"/>
-        </w:rPr>
-        <w:t xml:space="preserve"> and interviewing.io):</w:t>
-      </w:r>
-      <w:r>
-        <w:rPr>
-          <w:sz w:val="24"/>
-          <w:szCs w:val="24"/>
-        </w:rPr>
-        <w:t xml:space="preserve"> Connect candidates with peers or professional engineers for live practice. They give realistic feedback but depend on scheduling and availability of people.</w:t>
-      </w:r>
-    </w:p>
-    <w:p>
-      <w:pPr>
-        <w:pStyle w:val="ListParagraph"/>
-        <w:widowControl/>
-        <w:numPr>
-          <w:ilvl w:val="0"/>
-          <w:numId w:val="17"/>
-        </w:numPr>
-        <w:autoSpaceDE/>
-        <w:autoSpaceDN/>
-        <w:spacing w:after="160" w:line="259" w:lineRule="auto"/>
-        <w:contextualSpacing/>
-        <w:jc w:val="both"/>
-        <w:rPr>
-          <w:sz w:val="24"/>
-          <w:szCs w:val="24"/>
-        </w:rPr>
-      </w:pPr>
-      <w:r>
-        <w:rPr>
-          <w:b/>
-          <w:sz w:val="24"/>
-          <w:szCs w:val="24"/>
-        </w:rPr>
-        <w:t xml:space="preserve">Asynchronous video interview platforms (for example </w:t>
-      </w:r>
-      <w:proofErr w:type="spellStart"/>
-      <w:r>
-        <w:rPr>
-          <w:b/>
-          <w:sz w:val="24"/>
-          <w:szCs w:val="24"/>
-        </w:rPr>
-        <w:t>HireVue</w:t>
-      </w:r>
-      <w:proofErr w:type="spellEnd"/>
-      <w:r>
-        <w:rPr>
-          <w:b/>
-          <w:sz w:val="24"/>
-          <w:szCs w:val="24"/>
-        </w:rPr>
-        <w:t>):</w:t>
-      </w:r>
-      <w:r>
-        <w:rPr>
-          <w:sz w:val="24"/>
-          <w:szCs w:val="24"/>
-        </w:rPr>
-        <w:t xml:space="preserve"> Candidates record answers to fixed prompts, and employers review or score them. They are built for recruiters rather than for candidate learning.</w:t>
-      </w:r>
-    </w:p>
-    <w:p>
-      <w:pPr>
-        <w:pStyle w:val="ListParagraph"/>
-        <w:widowControl/>
-        <w:numPr>
-          <w:ilvl w:val="0"/>
-          <w:numId w:val="17"/>
-        </w:numPr>
-        <w:autoSpaceDE/>
-        <w:autoSpaceDN/>
-        <w:spacing w:after="160" w:line="259" w:lineRule="auto"/>
-        <w:contextualSpacing/>
-        <w:jc w:val="both"/>
-        <w:rPr>
-          <w:sz w:val="24"/>
-          <w:szCs w:val="24"/>
-        </w:rPr>
-      </w:pPr>
-      <w:r>
-        <w:rPr>
-          <w:b/>
-          <w:sz w:val="24"/>
-          <w:szCs w:val="24"/>
-        </w:rPr>
-        <w:t>Practice tools from large vendors (for example Google Interview Warmup):</w:t>
-      </w:r>
-      <w:r>
-        <w:rPr>
-          <w:sz w:val="24"/>
-          <w:szCs w:val="24"/>
-        </w:rPr>
-        <w:t xml:space="preserve"> Present questions, transcribe spoken answers and give general insights, but the question set is generic and the interaction is not a free-flowing conversation.</w:t>
-      </w:r>
-    </w:p>
-    <w:p>
-      <w:pPr>
-        <w:pStyle w:val="ListParagraph"/>
-        <w:widowControl/>
-        <w:numPr>
-          <w:ilvl w:val="0"/>
-          <w:numId w:val="17"/>
-        </w:numPr>
-        <w:autoSpaceDE/>
-        <w:autoSpaceDN/>
-        <w:spacing w:after="160" w:line="259" w:lineRule="auto"/>
-        <w:contextualSpacing/>
-        <w:jc w:val="both"/>
-        <w:rPr>
-          <w:sz w:val="24"/>
-          <w:szCs w:val="24"/>
-        </w:rPr>
-      </w:pPr>
-      <w:r>
-        <w:rPr>
-          <w:b/>
-          <w:sz w:val="24"/>
-          <w:szCs w:val="24"/>
-        </w:rPr>
-        <w:t>Text chatbots built on general LLMs:</w:t>
-      </w:r>
-      <w:r>
-        <w:rPr>
-          <w:sz w:val="24"/>
-          <w:szCs w:val="24"/>
-        </w:rPr>
-        <w:t xml:space="preserve"> Can simulate an interviewer in chat, but have no voice, no acoustic analysis and no structured scoring.</w:t>
-      </w:r>
-    </w:p>
-    <w:p>
-      <w:pPr>
-        <w:pStyle w:val="ListParagraph"/>
-        <w:widowControl/>
-        <w:numPr>
-          <w:ilvl w:val="0"/>
-          <w:numId w:val="17"/>
-        </w:numPr>
-        <w:autoSpaceDE/>
-        <w:autoSpaceDN/>
-        <w:spacing w:after="160" w:line="259" w:lineRule="auto"/>
-        <w:contextualSpacing/>
-        <w:jc w:val="both"/>
-        <w:rPr>
-          <w:sz w:val="24"/>
-          <w:szCs w:val="24"/>
-        </w:rPr>
-      </w:pPr>
-      <w:r>
-        <w:rPr>
-          <w:b/>
-          <w:sz w:val="24"/>
-          <w:szCs w:val="24"/>
-        </w:rPr>
-        <w:t>Cloud voice assistants and voice-agent APIs:</w:t>
-      </w:r>
-      <w:r>
-        <w:rPr>
-          <w:sz w:val="24"/>
-          <w:szCs w:val="24"/>
-        </w:rPr>
         <w:t xml:space="preserve"> Offer speech interaction but add network round-trip latency, per-minute cost and data-privacy concerns.</w:t>
       </w:r>
-    </w:p>
-    <w:p>
-      <w:pPr>
-        <w:pStyle w:val="ListParagraph"/>
-        <w:spacing w:line="360" w:lineRule="auto"/>
-        <w:jc w:val="both"/>
-        <w:rPr>
-          <w:sz w:val="24"/>
-        </w:rPr>
-      </w:pPr>
-    </w:p>
-    <w:p>
-      <w:pPr>
-        <w:pStyle w:val="ListParagraph"/>
-        <w:spacing w:line="360" w:lineRule="auto"/>
-        <w:jc w:val="both"/>
-        <w:rPr>
-          <w:sz w:val="24"/>
-        </w:rPr>
-      </w:pPr>
     </w:p>
     <w:tbl>
       <w:tblPr>
         <w:tblStyle w:val="TableGrid"/>
         <w:tblW w:w="0" w:type="auto"/>
+        <w:jc w:val="center"/>
         <w:tblLook w:val="04A0" w:firstRow="1" w:lastRow="0" w:firstColumn="1" w:lastColumn="0" w:noHBand="0" w:noVBand="1"/>
       </w:tblPr>
       <w:tblGrid>
@@ -9259,6 +9159,9 @@
         <w:gridCol w:w="4252"/>
       </w:tblGrid>
       <w:tr>
+        <w:trPr>
+          <w:jc w:val="center"/>
+        </w:trPr>
         <w:tc>
           <w:tcPr>
             <w:tcW w:w="2268" w:type="dxa"/>
@@ -9274,7 +9177,6 @@
           <w:p>
             <w:pPr>
               <w:spacing w:before="20" w:after="20"/>
-              <w:jc w:val="center"/>
               <w:rPr>
                 <w:sz w:val="24"/>
                 <w:szCs w:val="24"/>
@@ -9335,7 +9237,6 @@
           <w:p>
             <w:pPr>
               <w:spacing w:before="20" w:after="20"/>
-              <w:jc w:val="center"/>
               <w:rPr>
                 <w:sz w:val="24"/>
                 <w:szCs w:val="24"/>
@@ -9353,6 +9254,9 @@
         </w:tc>
       </w:tr>
       <w:tr>
+        <w:trPr>
+          <w:jc w:val="center"/>
+        </w:trPr>
         <w:tc>
           <w:tcPr>
             <w:tcW w:w="2268" w:type="dxa"/>
@@ -9367,7 +9271,6 @@
           <w:p>
             <w:pPr>
               <w:spacing w:before="20" w:after="20"/>
-              <w:jc w:val="center"/>
               <w:rPr>
                 <w:sz w:val="24"/>
                 <w:szCs w:val="24"/>
@@ -9426,7 +9329,6 @@
           <w:p>
             <w:pPr>
               <w:spacing w:before="20" w:after="20"/>
-              <w:jc w:val="center"/>
               <w:rPr>
                 <w:sz w:val="24"/>
                 <w:szCs w:val="24"/>
@@ -9443,6 +9345,9 @@
         </w:tc>
       </w:tr>
       <w:tr>
+        <w:trPr>
+          <w:jc w:val="center"/>
+        </w:trPr>
         <w:tc>
           <w:tcPr>
             <w:tcW w:w="2268" w:type="dxa"/>
@@ -9457,7 +9362,6 @@
           <w:p>
             <w:pPr>
               <w:spacing w:before="20" w:after="20"/>
-              <w:jc w:val="center"/>
               <w:rPr>
                 <w:sz w:val="24"/>
                 <w:szCs w:val="24"/>
@@ -9514,7 +9418,6 @@
           <w:p>
             <w:pPr>
               <w:spacing w:before="20" w:after="20"/>
-              <w:jc w:val="center"/>
               <w:rPr>
                 <w:sz w:val="24"/>
                 <w:szCs w:val="24"/>
@@ -9531,6 +9434,9 @@
         </w:tc>
       </w:tr>
       <w:tr>
+        <w:trPr>
+          <w:jc w:val="center"/>
+        </w:trPr>
         <w:tc>
           <w:tcPr>
             <w:tcW w:w="2268" w:type="dxa"/>
@@ -9545,7 +9451,6 @@
           <w:p>
             <w:pPr>
               <w:spacing w:before="20" w:after="20"/>
-              <w:jc w:val="center"/>
               <w:rPr>
                 <w:sz w:val="24"/>
                 <w:szCs w:val="24"/>
@@ -9604,7 +9509,6 @@
           <w:p>
             <w:pPr>
               <w:spacing w:before="20" w:after="20"/>
-              <w:jc w:val="center"/>
               <w:rPr>
                 <w:sz w:val="24"/>
                 <w:szCs w:val="24"/>
@@ -9621,6 +9525,9 @@
         </w:tc>
       </w:tr>
       <w:tr>
+        <w:trPr>
+          <w:jc w:val="center"/>
+        </w:trPr>
         <w:tc>
           <w:tcPr>
             <w:tcW w:w="2268" w:type="dxa"/>
@@ -9635,7 +9542,6 @@
           <w:p>
             <w:pPr>
               <w:spacing w:before="20" w:after="20"/>
-              <w:jc w:val="center"/>
               <w:rPr>
                 <w:sz w:val="24"/>
                 <w:szCs w:val="24"/>
@@ -9692,7 +9598,6 @@
           <w:p>
             <w:pPr>
               <w:spacing w:before="20" w:after="20"/>
-              <w:jc w:val="center"/>
               <w:rPr>
                 <w:sz w:val="24"/>
                 <w:szCs w:val="24"/>
@@ -9709,6 +9614,9 @@
         </w:tc>
       </w:tr>
       <w:tr>
+        <w:trPr>
+          <w:jc w:val="center"/>
+        </w:trPr>
         <w:tc>
           <w:tcPr>
             <w:tcW w:w="2268" w:type="dxa"/>
@@ -9723,7 +9631,6 @@
           <w:p>
             <w:pPr>
               <w:spacing w:before="20" w:after="20"/>
-              <w:jc w:val="center"/>
               <w:rPr>
                 <w:sz w:val="24"/>
                 <w:szCs w:val="24"/>
@@ -9780,7 +9687,6 @@
           <w:p>
             <w:pPr>
               <w:spacing w:before="20" w:after="20"/>
-              <w:jc w:val="center"/>
               <w:rPr>
                 <w:sz w:val="24"/>
                 <w:szCs w:val="24"/>
@@ -9797,6 +9703,9 @@
         </w:tc>
       </w:tr>
       <w:tr>
+        <w:trPr>
+          <w:jc w:val="center"/>
+        </w:trPr>
         <w:tc>
           <w:tcPr>
             <w:tcW w:w="2268" w:type="dxa"/>
@@ -9811,7 +9720,6 @@
           <w:p>
             <w:pPr>
               <w:spacing w:before="20" w:after="20"/>
-              <w:jc w:val="center"/>
               <w:rPr>
                 <w:sz w:val="24"/>
                 <w:szCs w:val="24"/>
@@ -9868,7 +9776,6 @@
           <w:p>
             <w:pPr>
               <w:spacing w:before="20" w:after="20"/>
-              <w:jc w:val="center"/>
               <w:rPr>
                 <w:sz w:val="24"/>
                 <w:szCs w:val="24"/>
@@ -16328,12 +16235,6 @@
     </w:p>
     <w:p>
       <w:pPr>
-        <w:spacing w:before="40" w:after="80"/>
-        <w:jc w:val="both"/>
-      </w:pPr>
-    </w:p>
-    <w:p>
-      <w:pPr>
         <w:spacing w:before="280" w:after="80"/>
         <w:rPr>
           <w:b/>
@@ -16538,6 +16439,320 @@
     </w:p>
     <w:p>
       <w:pPr>
+        <w:spacing w:before="280" w:after="80"/>
+      </w:pPr>
+      <w:r>
+        <w:rPr>
+          <w:b/>
+          <w:sz w:val="28"/>
+        </w:rPr>
+        <w:t>4.3 Four-Stage AI Pipeline Design</w:t>
+      </w:r>
+    </w:p>
+    <w:p>
+      <w:pPr>
+        <w:spacing w:before="200" w:after="60"/>
+      </w:pPr>
+      <w:r>
+        <w:rPr>
+          <w:b/>
+          <w:sz w:val="25"/>
+        </w:rPr>
+        <w:t>Stage 1 — Research Model</w:t>
+      </w:r>
+    </w:p>
+    <w:p>
+      <w:pPr>
+        <w:spacing w:before="40" w:after="80"/>
+        <w:jc w:val="both"/>
+      </w:pPr>
+      <w:r>
+        <w:rPr>
+          <w:sz w:val="24"/>
+        </w:rPr>
+        <w:t xml:space="preserve">Accepts Job Description text → </w:t>
+      </w:r>
+      <w:proofErr w:type="spellStart"/>
+      <w:r>
+        <w:rPr>
+          <w:sz w:val="24"/>
+        </w:rPr>
+        <w:t>Tavily</w:t>
+      </w:r>
+      <w:proofErr w:type="spellEnd"/>
+      <w:r>
+        <w:rPr>
+          <w:sz w:val="24"/>
+        </w:rPr>
+        <w:t xml:space="preserve"> domain-restricted web search → Gemini 3.6 Flash synthesizes </w:t>
+      </w:r>
+      <w:proofErr w:type="spellStart"/>
+      <w:r>
+        <w:rPr>
+          <w:sz w:val="24"/>
+        </w:rPr>
+        <w:t>InterviewRubric</w:t>
+      </w:r>
+      <w:proofErr w:type="spellEnd"/>
+      <w:r>
+        <w:rPr>
+          <w:sz w:val="24"/>
+        </w:rPr>
+        <w:t xml:space="preserve"> JSON. SHA-256 cache prevents redundant API calls.</w:t>
+      </w:r>
+    </w:p>
+    <w:p>
+      <w:pPr>
+        <w:spacing w:before="200" w:after="60"/>
+      </w:pPr>
+      <w:r>
+        <w:rPr>
+          <w:b/>
+          <w:sz w:val="25"/>
+        </w:rPr>
+        <w:t>Stage 2 — Question Engine</w:t>
+      </w:r>
+    </w:p>
+    <w:p>
+      <w:pPr>
+        <w:spacing w:before="40" w:after="80"/>
+        <w:jc w:val="both"/>
+      </w:pPr>
+      <w:r>
+        <w:rPr>
+          <w:sz w:val="24"/>
+        </w:rPr>
+        <w:t xml:space="preserve">Accepts Stage 1 rubric + candidate resume → Dual parallel Planner (15-question tree) and Analyst (skill-gap matrix) → Outputs 3 JSON artifacts: </w:t>
+      </w:r>
+      <w:proofErr w:type="spellStart"/>
+      <w:r>
+        <w:rPr>
+          <w:sz w:val="24"/>
+        </w:rPr>
+        <w:t>interview_questions.json</w:t>
+      </w:r>
+      <w:proofErr w:type="spellEnd"/>
+      <w:r>
+        <w:rPr>
+          <w:sz w:val="24"/>
+        </w:rPr>
+        <w:t xml:space="preserve">, </w:t>
+      </w:r>
+      <w:proofErr w:type="spellStart"/>
+      <w:r>
+        <w:rPr>
+          <w:sz w:val="24"/>
+        </w:rPr>
+        <w:t>interviewer_behavior.json</w:t>
+      </w:r>
+      <w:proofErr w:type="spellEnd"/>
+      <w:r>
+        <w:rPr>
+          <w:sz w:val="24"/>
+        </w:rPr>
+        <w:t xml:space="preserve">, </w:t>
+      </w:r>
+      <w:proofErr w:type="spellStart"/>
+      <w:r>
+        <w:rPr>
+          <w:sz w:val="24"/>
+        </w:rPr>
+        <w:t>resume_analysis.json</w:t>
+      </w:r>
+      <w:proofErr w:type="spellEnd"/>
+      <w:r>
+        <w:rPr>
+          <w:sz w:val="24"/>
+        </w:rPr>
+        <w:t>.</w:t>
+      </w:r>
+    </w:p>
+    <w:p>
+      <w:pPr>
+        <w:spacing w:before="200" w:after="60"/>
+      </w:pPr>
+      <w:r>
+        <w:rPr>
+          <w:b/>
+          <w:sz w:val="25"/>
+        </w:rPr>
+        <w:t>Stage 3 — Voice-to-Voice Model</w:t>
+      </w:r>
+    </w:p>
+    <w:p>
+      <w:pPr>
+        <w:spacing w:before="40" w:after="80"/>
+        <w:jc w:val="both"/>
+      </w:pPr>
+      <w:r>
+        <w:rPr>
+          <w:sz w:val="24"/>
+        </w:rPr>
+        <w:t xml:space="preserve">Browser 16kHz PCM → </w:t>
+      </w:r>
+      <w:proofErr w:type="spellStart"/>
+      <w:r>
+        <w:rPr>
+          <w:sz w:val="24"/>
+        </w:rPr>
+        <w:t>Silero</w:t>
+      </w:r>
+      <w:proofErr w:type="spellEnd"/>
+      <w:r>
+        <w:rPr>
+          <w:sz w:val="24"/>
+        </w:rPr>
+        <w:t xml:space="preserve"> VAD → Faster-Whisper STT → </w:t>
+      </w:r>
+      <w:proofErr w:type="spellStart"/>
+      <w:r>
+        <w:rPr>
+          <w:sz w:val="24"/>
+        </w:rPr>
+        <w:t>Ollama</w:t>
+      </w:r>
+      <w:proofErr w:type="spellEnd"/>
+      <w:r>
+        <w:rPr>
+          <w:sz w:val="24"/>
+        </w:rPr>
+        <w:t xml:space="preserve"> Qwen 2.5 LLM → Kokoro-82M TTS → Browser audio. Level 2 </w:t>
+      </w:r>
+      <w:proofErr w:type="spellStart"/>
+      <w:r>
+        <w:rPr>
+          <w:sz w:val="24"/>
+        </w:rPr>
+        <w:t>TurnManager</w:t>
+      </w:r>
+      <w:proofErr w:type="spellEnd"/>
+      <w:r>
+        <w:rPr>
+          <w:sz w:val="24"/>
+        </w:rPr>
+        <w:t xml:space="preserve"> governs all </w:t>
+      </w:r>
+      <w:proofErr w:type="spellStart"/>
+      <w:r>
+        <w:rPr>
+          <w:sz w:val="24"/>
+        </w:rPr>
+        <w:t>ConversationState</w:t>
+      </w:r>
+      <w:proofErr w:type="spellEnd"/>
+      <w:r>
+        <w:rPr>
+          <w:sz w:val="24"/>
+        </w:rPr>
+        <w:t xml:space="preserve"> transitions.</w:t>
+      </w:r>
+    </w:p>
+    <w:p>
+      <w:pPr>
+        <w:spacing w:before="200" w:after="60"/>
+      </w:pPr>
+      <w:r>
+        <w:rPr>
+          <w:b/>
+          <w:sz w:val="25"/>
+        </w:rPr>
+        <w:t>Stage 4 — Reports Model</w:t>
+      </w:r>
+    </w:p>
+    <w:p>
+      <w:pPr>
+        <w:spacing w:before="40" w:after="80"/>
+        <w:jc w:val="both"/>
+      </w:pPr>
+      <w:r>
+        <w:rPr>
+          <w:sz w:val="24"/>
+        </w:rPr>
+        <w:t xml:space="preserve">Slices recording.wav into per-turn clips → 3-branch Gemini Multimodal Evaluation (Audio Acoustic, Technical Accuracy, Combined Summary) → </w:t>
+      </w:r>
+      <w:proofErr w:type="spellStart"/>
+      <w:proofErr w:type="gramStart"/>
+      <w:r>
+        <w:rPr>
+          <w:sz w:val="24"/>
+        </w:rPr>
+        <w:t>report.json</w:t>
+      </w:r>
+      <w:proofErr w:type="spellEnd"/>
+      <w:proofErr w:type="gramEnd"/>
+      <w:r>
+        <w:rPr>
+          <w:sz w:val="24"/>
+        </w:rPr>
+        <w:t xml:space="preserve"> + evaluation_summary.md.</w:t>
+      </w:r>
+    </w:p>
+    <w:p>
+      <w:pPr>
+        <w:spacing w:before="40" w:after="80"/>
+        <w:jc w:val="both"/>
+      </w:pPr>
+    </w:p>
+    <w:p>
+      <w:pPr>
+        <w:spacing w:before="40" w:after="80"/>
+        <w:jc w:val="both"/>
+      </w:pPr>
+    </w:p>
+    <w:p>
+      <w:pPr>
+        <w:spacing w:before="40" w:after="80"/>
+        <w:jc w:val="both"/>
+      </w:pPr>
+    </w:p>
+    <w:p>
+      <w:pPr>
+        <w:spacing w:before="40" w:after="80"/>
+        <w:jc w:val="both"/>
+      </w:pPr>
+    </w:p>
+    <w:p>
+      <w:pPr>
+        <w:spacing w:before="40" w:after="80"/>
+        <w:jc w:val="both"/>
+      </w:pPr>
+    </w:p>
+    <w:p>
+      <w:pPr>
+        <w:spacing w:before="40" w:after="80"/>
+        <w:jc w:val="both"/>
+      </w:pPr>
+    </w:p>
+    <w:p>
+      <w:pPr>
+        <w:spacing w:before="40" w:after="80"/>
+        <w:jc w:val="both"/>
+      </w:pPr>
+    </w:p>
+    <w:p>
+      <w:pPr>
+        <w:spacing w:before="280" w:after="80"/>
+        <w:rPr>
+          <w:b/>
+          <w:sz w:val="28"/>
+        </w:rPr>
+      </w:pPr>
+      <w:r>
+        <w:rPr>
+          <w:b/>
+          <w:sz w:val="28"/>
+        </w:rPr>
+        <w:lastRenderedPageBreak/>
+        <w:t>4.4 Data Flow Diagram (DFD)</w:t>
+      </w:r>
+    </w:p>
+    <w:p>
+      <w:pPr>
+        <w:spacing w:before="280" w:after="80"/>
+      </w:pPr>
+    </w:p>
+    <w:p>
+      <w:pPr>
         <w:spacing w:before="80" w:after="80"/>
         <w:ind w:left="454"/>
         <w:rPr>
@@ -16546,326 +16761,22 @@
           <w:sz w:val="18"/>
         </w:rPr>
       </w:pPr>
-    </w:p>
-    <w:p>
-      <w:pPr>
-        <w:spacing w:before="80" w:after="80"/>
-        <w:ind w:left="454"/>
-      </w:pPr>
-    </w:p>
-    <w:p>
-      <w:pPr>
-        <w:spacing w:before="280" w:after="80"/>
-      </w:pPr>
-      <w:r>
-        <w:rPr>
-          <w:b/>
-          <w:sz w:val="28"/>
-        </w:rPr>
-        <w:t>4.3 Four-Stage AI Pipeline Design</w:t>
-      </w:r>
-    </w:p>
-    <w:p>
-      <w:pPr>
-        <w:spacing w:before="200" w:after="60"/>
-      </w:pPr>
-      <w:r>
-        <w:rPr>
-          <w:b/>
-          <w:sz w:val="25"/>
-        </w:rPr>
-        <w:t>Stage 1 — Research Model</w:t>
-      </w:r>
-    </w:p>
-    <w:p>
-      <w:pPr>
-        <w:spacing w:before="40" w:after="80"/>
-        <w:jc w:val="both"/>
-      </w:pPr>
-      <w:r>
-        <w:rPr>
-          <w:sz w:val="24"/>
-        </w:rPr>
-        <w:t xml:space="preserve">Accepts Job Description text → </w:t>
-      </w:r>
-      <w:proofErr w:type="spellStart"/>
-      <w:r>
-        <w:rPr>
-          <w:sz w:val="24"/>
-        </w:rPr>
-        <w:t>Tavily</w:t>
-      </w:r>
-      <w:proofErr w:type="spellEnd"/>
-      <w:r>
-        <w:rPr>
-          <w:sz w:val="24"/>
-        </w:rPr>
-        <w:t xml:space="preserve"> domain-restricted web search → Gemini 3.6 Flash synthesizes </w:t>
-      </w:r>
-      <w:proofErr w:type="spellStart"/>
-      <w:r>
-        <w:rPr>
-          <w:sz w:val="24"/>
-        </w:rPr>
-        <w:t>InterviewRubric</w:t>
-      </w:r>
-      <w:proofErr w:type="spellEnd"/>
-      <w:r>
-        <w:rPr>
-          <w:sz w:val="24"/>
-        </w:rPr>
-        <w:t xml:space="preserve"> JSON. SHA-256 cache prevents redundant API calls.</w:t>
-      </w:r>
-    </w:p>
-    <w:p>
-      <w:pPr>
-        <w:spacing w:before="200" w:after="60"/>
-      </w:pPr>
-      <w:r>
-        <w:rPr>
-          <w:b/>
-          <w:sz w:val="25"/>
-        </w:rPr>
-        <w:t>Stage 2 — Question Engine</w:t>
-      </w:r>
-    </w:p>
-    <w:p>
-      <w:pPr>
-        <w:spacing w:before="40" w:after="80"/>
-        <w:jc w:val="both"/>
-      </w:pPr>
-      <w:r>
-        <w:rPr>
-          <w:sz w:val="24"/>
-        </w:rPr>
-        <w:t xml:space="preserve">Accepts Stage 1 rubric + candidate resume → Dual parallel Planner (15-question tree) and Analyst (skill-gap matrix) → Outputs 3 JSON artifacts: </w:t>
-      </w:r>
-      <w:proofErr w:type="spellStart"/>
-      <w:r>
-        <w:rPr>
-          <w:sz w:val="24"/>
-        </w:rPr>
-        <w:t>interview_questions.json</w:t>
-      </w:r>
-      <w:proofErr w:type="spellEnd"/>
-      <w:r>
-        <w:rPr>
-          <w:sz w:val="24"/>
-        </w:rPr>
-        <w:t xml:space="preserve">, </w:t>
-      </w:r>
-      <w:proofErr w:type="spellStart"/>
-      <w:r>
-        <w:rPr>
-          <w:sz w:val="24"/>
-        </w:rPr>
-        <w:t>interviewer_behavior.json</w:t>
-      </w:r>
-      <w:proofErr w:type="spellEnd"/>
-      <w:r>
-        <w:rPr>
-          <w:sz w:val="24"/>
-        </w:rPr>
-        <w:t xml:space="preserve">, </w:t>
-      </w:r>
-      <w:proofErr w:type="spellStart"/>
-      <w:r>
-        <w:rPr>
-          <w:sz w:val="24"/>
-        </w:rPr>
-        <w:t>resume_analysis.json</w:t>
-      </w:r>
-      <w:proofErr w:type="spellEnd"/>
-      <w:r>
-        <w:rPr>
-          <w:sz w:val="24"/>
-        </w:rPr>
-        <w:t>.</w:t>
-      </w:r>
-    </w:p>
-    <w:p>
-      <w:pPr>
-        <w:spacing w:before="200" w:after="60"/>
-      </w:pPr>
-      <w:r>
-        <w:rPr>
-          <w:b/>
-          <w:sz w:val="25"/>
-        </w:rPr>
-        <w:t>Stage 3 — Voice-to-Voice Model</w:t>
-      </w:r>
-    </w:p>
-    <w:p>
-      <w:pPr>
-        <w:spacing w:before="40" w:after="80"/>
-        <w:jc w:val="both"/>
-      </w:pPr>
-      <w:r>
-        <w:rPr>
-          <w:sz w:val="24"/>
-        </w:rPr>
-        <w:t xml:space="preserve">Browser 16kHz PCM → </w:t>
-      </w:r>
-      <w:proofErr w:type="spellStart"/>
-      <w:r>
-        <w:rPr>
-          <w:sz w:val="24"/>
-        </w:rPr>
-        <w:t>Silero</w:t>
-      </w:r>
-      <w:proofErr w:type="spellEnd"/>
-      <w:r>
-        <w:rPr>
-          <w:sz w:val="24"/>
-        </w:rPr>
-        <w:t xml:space="preserve"> VAD → Faster-Whisper STT → </w:t>
-      </w:r>
-      <w:proofErr w:type="spellStart"/>
-      <w:r>
-        <w:rPr>
-          <w:sz w:val="24"/>
-        </w:rPr>
-        <w:t>Ollama</w:t>
-      </w:r>
-      <w:proofErr w:type="spellEnd"/>
-      <w:r>
-        <w:rPr>
-          <w:sz w:val="24"/>
-        </w:rPr>
-        <w:t xml:space="preserve"> Qwen 2.5 LLM → Kokoro-82M TTS → Browser audio. Level 2 </w:t>
-      </w:r>
-      <w:proofErr w:type="spellStart"/>
-      <w:r>
-        <w:rPr>
-          <w:sz w:val="24"/>
-        </w:rPr>
-        <w:t>TurnManager</w:t>
-      </w:r>
-      <w:proofErr w:type="spellEnd"/>
-      <w:r>
-        <w:rPr>
-          <w:sz w:val="24"/>
-        </w:rPr>
-        <w:t xml:space="preserve"> governs all </w:t>
-      </w:r>
-      <w:proofErr w:type="spellStart"/>
-      <w:r>
-        <w:rPr>
-          <w:sz w:val="24"/>
-        </w:rPr>
-        <w:t>ConversationState</w:t>
-      </w:r>
-      <w:proofErr w:type="spellEnd"/>
-      <w:r>
-        <w:rPr>
-          <w:sz w:val="24"/>
-        </w:rPr>
-        <w:t xml:space="preserve"> transitions.</w:t>
-      </w:r>
-    </w:p>
-    <w:p>
-      <w:pPr>
-        <w:spacing w:before="200" w:after="60"/>
-      </w:pPr>
-      <w:r>
-        <w:rPr>
-          <w:b/>
-          <w:sz w:val="25"/>
-        </w:rPr>
-        <w:t>Stage 4 — Reports Model</w:t>
-      </w:r>
-    </w:p>
-    <w:p>
-      <w:pPr>
-        <w:spacing w:before="40" w:after="80"/>
-        <w:jc w:val="both"/>
-      </w:pPr>
-      <w:r>
-        <w:rPr>
-          <w:sz w:val="24"/>
-        </w:rPr>
-        <w:t xml:space="preserve">Slices recording.wav into per-turn clips → 3-branch Gemini Multimodal Evaluation (Audio Acoustic, Technical Accuracy, Combined Summary) → </w:t>
-      </w:r>
-      <w:proofErr w:type="spellStart"/>
-      <w:r>
-        <w:rPr>
-          <w:sz w:val="24"/>
-        </w:rPr>
-        <w:t>report.json</w:t>
-      </w:r>
-      <w:proofErr w:type="spellEnd"/>
-      <w:r>
-        <w:rPr>
-          <w:sz w:val="24"/>
-        </w:rPr>
-        <w:t xml:space="preserve"> + evaluation_summary.md.</w:t>
-      </w:r>
-    </w:p>
-    <w:p>
-      <w:pPr>
-        <w:spacing w:before="280" w:after="80"/>
-        <w:rPr>
-          <w:b/>
-          <w:sz w:val="28"/>
-        </w:rPr>
-      </w:pPr>
-    </w:p>
-    <w:p>
-      <w:pPr>
-        <w:spacing w:before="280" w:after="80"/>
-        <w:rPr>
-          <w:b/>
-          <w:sz w:val="28"/>
-        </w:rPr>
-      </w:pPr>
-    </w:p>
-    <w:p>
-      <w:pPr>
-        <w:spacing w:before="280" w:after="80"/>
-        <w:rPr>
-          <w:b/>
-          <w:sz w:val="28"/>
-        </w:rPr>
-      </w:pPr>
-    </w:p>
-    <w:p>
-      <w:pPr>
-        <w:spacing w:before="280" w:after="80"/>
-        <w:rPr>
-          <w:b/>
-          <w:sz w:val="28"/>
-        </w:rPr>
-      </w:pPr>
-      <w:r>
-        <w:rPr>
-          <w:b/>
-          <w:sz w:val="28"/>
-        </w:rPr>
-        <w:t>4.4 Data Flow Diagram (DFD)</w:t>
-      </w:r>
-    </w:p>
-    <w:p>
-      <w:pPr>
-        <w:spacing w:before="280" w:after="80"/>
-      </w:pPr>
-    </w:p>
-    <w:p>
-      <w:pPr>
-        <w:spacing w:before="80" w:after="80"/>
-        <w:ind w:left="454"/>
+      <w:r>
         <w:rPr>
           <w:rFonts w:ascii="Courier New" w:hAnsi="Courier New"/>
           <w:color w:val="222222"/>
           <w:sz w:val="18"/>
         </w:rPr>
-      </w:pPr>
+        <w:t>Level 0 (Context):</w:t>
+      </w:r>
       <w:r>
         <w:rPr>
           <w:rFonts w:ascii="Courier New" w:hAnsi="Courier New"/>
           <w:color w:val="222222"/>
           <w:sz w:val="18"/>
         </w:rPr>
-        <w:t>Level 0 (Context):</w:t>
+        <w:br/>
+        <w:t>[Candidate] ── Resume + JD ──▶ [NETRAN AI] ── Evaluation Report ──▶ [Candidate]</w:t>
       </w:r>
       <w:r>
         <w:rPr>
@@ -16874,7 +16785,7 @@
           <w:sz w:val="18"/>
         </w:rPr>
         <w:br/>
-        <w:t>[Candidate] ── Resume + JD ──▶ [NETRAN AI] ── Evaluation Report ──▶ [Candidate]</w:t>
+        <w:t xml:space="preserve">                                      │</w:t>
       </w:r>
       <w:r>
         <w:rPr>
@@ -16883,34 +16794,33 @@
           <w:sz w:val="18"/>
         </w:rPr>
         <w:br/>
-        <w:t xml:space="preserve">                                      │</w:t>
-      </w:r>
+        <w:t xml:space="preserve">                              [</w:t>
+      </w:r>
+      <w:proofErr w:type="spellStart"/>
       <w:r>
         <w:rPr>
           <w:rFonts w:ascii="Courier New" w:hAnsi="Courier New"/>
           <w:color w:val="222222"/>
           <w:sz w:val="18"/>
         </w:rPr>
-        <w:br/>
-        <w:t xml:space="preserve">                              [</w:t>
-      </w:r>
-      <w:proofErr w:type="spellStart"/>
+        <w:t>Tavily</w:t>
+      </w:r>
+      <w:proofErr w:type="spellEnd"/>
       <w:r>
         <w:rPr>
           <w:rFonts w:ascii="Courier New" w:hAnsi="Courier New"/>
           <w:color w:val="222222"/>
           <w:sz w:val="18"/>
         </w:rPr>
-        <w:t>Tavily</w:t>
-      </w:r>
-      <w:proofErr w:type="spellEnd"/>
+        <w:t xml:space="preserve"> / Gemini APIs]</w:t>
+      </w:r>
       <w:r>
         <w:rPr>
           <w:rFonts w:ascii="Courier New" w:hAnsi="Courier New"/>
           <w:color w:val="222222"/>
           <w:sz w:val="18"/>
         </w:rPr>
-        <w:t xml:space="preserve"> / Gemini APIs]</w:t>
+        <w:br/>
       </w:r>
       <w:r>
         <w:rPr>
@@ -16919,6 +16829,7 @@
           <w:sz w:val="18"/>
         </w:rPr>
         <w:br/>
+        <w:t>Level 1:</w:t>
       </w:r>
       <w:r>
         <w:rPr>
@@ -16927,7 +16838,7 @@
           <w:sz w:val="18"/>
         </w:rPr>
         <w:br/>
-        <w:t>Level 1:</w:t>
+        <w:t>[Resume] → [Ingest Engine] → [Stage 2: Question Engine]</w:t>
       </w:r>
       <w:r>
         <w:rPr>
@@ -16936,7 +16847,7 @@
           <w:sz w:val="18"/>
         </w:rPr>
         <w:br/>
-        <w:t>[Resume] → [Ingest Engine] → [Stage 2: Question Engine]</w:t>
+        <w:t>[JD]     → [Stage 1: Research] → [Interview Rubric]</w:t>
       </w:r>
       <w:r>
         <w:rPr>
@@ -16945,7 +16856,7 @@
           <w:sz w:val="18"/>
         </w:rPr>
         <w:br/>
-        <w:t>[JD]     → [Stage 1: Research] → [Interview Rubric]</w:t>
+        <w:t xml:space="preserve">                                        ↓</w:t>
       </w:r>
       <w:r>
         <w:rPr>
@@ -16954,61 +16865,61 @@
           <w:sz w:val="18"/>
         </w:rPr>
         <w:br/>
-        <w:t xml:space="preserve">                                        ↓</w:t>
-      </w:r>
+        <w:t xml:space="preserve">                         [</w:t>
+      </w:r>
+      <w:proofErr w:type="spellStart"/>
       <w:r>
         <w:rPr>
           <w:rFonts w:ascii="Courier New" w:hAnsi="Courier New"/>
           <w:color w:val="222222"/>
           <w:sz w:val="18"/>
         </w:rPr>
-        <w:br/>
-        <w:t xml:space="preserve">                         [</w:t>
-      </w:r>
-      <w:proofErr w:type="spellStart"/>
+        <w:t>interview_questions.json</w:t>
+      </w:r>
+      <w:proofErr w:type="spellEnd"/>
       <w:r>
         <w:rPr>
           <w:rFonts w:ascii="Courier New" w:hAnsi="Courier New"/>
           <w:color w:val="222222"/>
           <w:sz w:val="18"/>
         </w:rPr>
-        <w:t>interview_questions.json</w:t>
-      </w:r>
-      <w:proofErr w:type="spellEnd"/>
+        <w:t>]</w:t>
+      </w:r>
       <w:r>
         <w:rPr>
           <w:rFonts w:ascii="Courier New" w:hAnsi="Courier New"/>
           <w:color w:val="222222"/>
           <w:sz w:val="18"/>
         </w:rPr>
-        <w:t>]</w:t>
-      </w:r>
+        <w:br/>
+        <w:t xml:space="preserve">                         [</w:t>
+      </w:r>
+      <w:proofErr w:type="spellStart"/>
       <w:r>
         <w:rPr>
           <w:rFonts w:ascii="Courier New" w:hAnsi="Courier New"/>
           <w:color w:val="222222"/>
           <w:sz w:val="18"/>
         </w:rPr>
-        <w:br/>
-        <w:t xml:space="preserve">                         [</w:t>
-      </w:r>
-      <w:proofErr w:type="spellStart"/>
+        <w:t>interviewer_behavior.json</w:t>
+      </w:r>
+      <w:proofErr w:type="spellEnd"/>
       <w:r>
         <w:rPr>
           <w:rFonts w:ascii="Courier New" w:hAnsi="Courier New"/>
           <w:color w:val="222222"/>
           <w:sz w:val="18"/>
         </w:rPr>
-        <w:t>interviewer_behavior.json</w:t>
-      </w:r>
-      <w:proofErr w:type="spellEnd"/>
+        <w:t>]</w:t>
+      </w:r>
       <w:r>
         <w:rPr>
           <w:rFonts w:ascii="Courier New" w:hAnsi="Courier New"/>
           <w:color w:val="222222"/>
           <w:sz w:val="18"/>
         </w:rPr>
-        <w:t>]</w:t>
+        <w:br/>
+        <w:t xml:space="preserve">                                        ↓</w:t>
       </w:r>
       <w:r>
         <w:rPr>
@@ -17017,7 +16928,7 @@
           <w:sz w:val="18"/>
         </w:rPr>
         <w:br/>
-        <w:t xml:space="preserve">                                        ↓</w:t>
+        <w:t xml:space="preserve">                         [Stage 3: Voice Loop]</w:t>
       </w:r>
       <w:r>
         <w:rPr>
@@ -17026,7 +16937,7 @@
           <w:sz w:val="18"/>
         </w:rPr>
         <w:br/>
-        <w:t xml:space="preserve">                         [Stage 3: Voice Loop]</w:t>
+        <w:t xml:space="preserve">                         ◀── WebSocket PCM ──▶ [Browser]</w:t>
       </w:r>
       <w:r>
         <w:rPr>
@@ -17035,7 +16946,7 @@
           <w:sz w:val="18"/>
         </w:rPr>
         <w:br/>
-        <w:t xml:space="preserve">                         ◀── WebSocket PCM ──▶ [Browser]</w:t>
+        <w:t xml:space="preserve">                                        ↓</w:t>
       </w:r>
       <w:r>
         <w:rPr>
@@ -17044,34 +16955,34 @@
           <w:sz w:val="18"/>
         </w:rPr>
         <w:br/>
-        <w:t xml:space="preserve">                                        ↓</w:t>
-      </w:r>
+        <w:t xml:space="preserve">                         [recording.wav + </w:t>
+      </w:r>
+      <w:proofErr w:type="spellStart"/>
       <w:r>
         <w:rPr>
           <w:rFonts w:ascii="Courier New" w:hAnsi="Courier New"/>
           <w:color w:val="222222"/>
           <w:sz w:val="18"/>
         </w:rPr>
-        <w:br/>
-        <w:t xml:space="preserve">                         [recording.wav + </w:t>
-      </w:r>
-      <w:proofErr w:type="spellStart"/>
+        <w:t>transcript.json</w:t>
+      </w:r>
+      <w:proofErr w:type="spellEnd"/>
       <w:r>
         <w:rPr>
           <w:rFonts w:ascii="Courier New" w:hAnsi="Courier New"/>
           <w:color w:val="222222"/>
           <w:sz w:val="18"/>
         </w:rPr>
-        <w:t>transcript.json</w:t>
-      </w:r>
-      <w:proofErr w:type="spellEnd"/>
+        <w:t>]</w:t>
+      </w:r>
       <w:r>
         <w:rPr>
           <w:rFonts w:ascii="Courier New" w:hAnsi="Courier New"/>
           <w:color w:val="222222"/>
           <w:sz w:val="18"/>
         </w:rPr>
-        <w:t>]</w:t>
+        <w:br/>
+        <w:t xml:space="preserve">                                        ↓</w:t>
       </w:r>
       <w:r>
         <w:rPr>
@@ -17080,7 +16991,7 @@
           <w:sz w:val="18"/>
         </w:rPr>
         <w:br/>
-        <w:t xml:space="preserve">                                        ↓</w:t>
+        <w:t xml:space="preserve">                         [Stage 4: Evaluation]</w:t>
       </w:r>
       <w:r>
         <w:rPr>
@@ -17089,7 +17000,7 @@
           <w:sz w:val="18"/>
         </w:rPr>
         <w:br/>
-        <w:t xml:space="preserve">                         [Stage 4: Evaluation]</w:t>
+        <w:t xml:space="preserve">                                        ↓</w:t>
       </w:r>
       <w:r>
         <w:rPr>
@@ -17098,33 +17009,24 @@
           <w:sz w:val="18"/>
         </w:rPr>
         <w:br/>
-        <w:t xml:space="preserve">                                        ↓</w:t>
-      </w:r>
+        <w:t xml:space="preserve">                         [</w:t>
+      </w:r>
+      <w:proofErr w:type="spellStart"/>
       <w:r>
         <w:rPr>
           <w:rFonts w:ascii="Courier New" w:hAnsi="Courier New"/>
           <w:color w:val="222222"/>
           <w:sz w:val="18"/>
         </w:rPr>
-        <w:br/>
-        <w:t xml:space="preserve">                         [</w:t>
-      </w:r>
-      <w:proofErr w:type="spellStart"/>
+        <w:t>report.json</w:t>
+      </w:r>
+      <w:proofErr w:type="spellEnd"/>
       <w:r>
         <w:rPr>
           <w:rFonts w:ascii="Courier New" w:hAnsi="Courier New"/>
           <w:color w:val="222222"/>
           <w:sz w:val="18"/>
         </w:rPr>
-        <w:t>report.json</w:t>
-      </w:r>
-      <w:proofErr w:type="spellEnd"/>
-      <w:r>
-        <w:rPr>
-          <w:rFonts w:ascii="Courier New" w:hAnsi="Courier New"/>
-          <w:color w:val="222222"/>
-          <w:sz w:val="18"/>
-        </w:rPr>
         <w:t xml:space="preserve"> + scorecard]</w:t>
       </w:r>
     </w:p>
@@ -17464,171 +17366,6 @@
     </w:p>
     <w:p>
       <w:pPr>
-        <w:pStyle w:val="ListBullet"/>
-        <w:numPr>
-          <w:ilvl w:val="0"/>
-          <w:numId w:val="0"/>
-        </w:numPr>
-        <w:spacing w:before="20" w:after="40"/>
-        <w:ind w:left="340"/>
-        <w:rPr>
-          <w:sz w:val="23"/>
-        </w:rPr>
-      </w:pPr>
-    </w:p>
-    <w:p>
-      <w:pPr>
-        <w:pStyle w:val="ListBullet"/>
-        <w:numPr>
-          <w:ilvl w:val="0"/>
-          <w:numId w:val="0"/>
-        </w:numPr>
-        <w:spacing w:before="20" w:after="40"/>
-        <w:ind w:left="340"/>
-        <w:rPr>
-          <w:sz w:val="23"/>
-        </w:rPr>
-      </w:pPr>
-    </w:p>
-    <w:p>
-      <w:pPr>
-        <w:pStyle w:val="ListBullet"/>
-        <w:numPr>
-          <w:ilvl w:val="0"/>
-          <w:numId w:val="0"/>
-        </w:numPr>
-        <w:spacing w:before="20" w:after="40"/>
-        <w:ind w:left="340"/>
-        <w:rPr>
-          <w:sz w:val="23"/>
-        </w:rPr>
-      </w:pPr>
-    </w:p>
-    <w:p>
-      <w:pPr>
-        <w:pStyle w:val="ListBullet"/>
-        <w:numPr>
-          <w:ilvl w:val="0"/>
-          <w:numId w:val="0"/>
-        </w:numPr>
-        <w:spacing w:before="20" w:after="40"/>
-        <w:ind w:left="340"/>
-        <w:rPr>
-          <w:sz w:val="23"/>
-        </w:rPr>
-      </w:pPr>
-    </w:p>
-    <w:p>
-      <w:pPr>
-        <w:pStyle w:val="ListBullet"/>
-        <w:numPr>
-          <w:ilvl w:val="0"/>
-          <w:numId w:val="0"/>
-        </w:numPr>
-        <w:spacing w:before="20" w:after="40"/>
-        <w:ind w:left="340"/>
-        <w:rPr>
-          <w:sz w:val="23"/>
-        </w:rPr>
-      </w:pPr>
-    </w:p>
-    <w:p>
-      <w:pPr>
-        <w:pStyle w:val="ListBullet"/>
-        <w:numPr>
-          <w:ilvl w:val="0"/>
-          <w:numId w:val="0"/>
-        </w:numPr>
-        <w:spacing w:before="20" w:after="40"/>
-        <w:ind w:left="340"/>
-        <w:rPr>
-          <w:sz w:val="23"/>
-        </w:rPr>
-      </w:pPr>
-    </w:p>
-    <w:p>
-      <w:pPr>
-        <w:pStyle w:val="ListBullet"/>
-        <w:numPr>
-          <w:ilvl w:val="0"/>
-          <w:numId w:val="0"/>
-        </w:numPr>
-        <w:spacing w:before="20" w:after="40"/>
-        <w:ind w:left="340"/>
-        <w:rPr>
-          <w:sz w:val="23"/>
-        </w:rPr>
-      </w:pPr>
-    </w:p>
-    <w:p>
-      <w:pPr>
-        <w:pStyle w:val="ListBullet"/>
-        <w:numPr>
-          <w:ilvl w:val="0"/>
-          <w:numId w:val="0"/>
-        </w:numPr>
-        <w:spacing w:before="20" w:after="40"/>
-        <w:ind w:left="340"/>
-        <w:rPr>
-          <w:sz w:val="23"/>
-        </w:rPr>
-      </w:pPr>
-    </w:p>
-    <w:p>
-      <w:pPr>
-        <w:pStyle w:val="ListBullet"/>
-        <w:numPr>
-          <w:ilvl w:val="0"/>
-          <w:numId w:val="0"/>
-        </w:numPr>
-        <w:spacing w:before="20" w:after="40"/>
-        <w:ind w:left="340"/>
-        <w:rPr>
-          <w:sz w:val="23"/>
-        </w:rPr>
-      </w:pPr>
-    </w:p>
-    <w:p>
-      <w:pPr>
-        <w:pStyle w:val="ListBullet"/>
-        <w:numPr>
-          <w:ilvl w:val="0"/>
-          <w:numId w:val="0"/>
-        </w:numPr>
-        <w:spacing w:before="20" w:after="40"/>
-        <w:ind w:left="340"/>
-        <w:rPr>
-          <w:sz w:val="23"/>
-        </w:rPr>
-      </w:pPr>
-    </w:p>
-    <w:p>
-      <w:pPr>
-        <w:pStyle w:val="ListBullet"/>
-        <w:numPr>
-          <w:ilvl w:val="0"/>
-          <w:numId w:val="0"/>
-        </w:numPr>
-        <w:spacing w:before="20" w:after="40"/>
-        <w:ind w:left="340"/>
-        <w:rPr>
-          <w:sz w:val="23"/>
-        </w:rPr>
-      </w:pPr>
-    </w:p>
-    <w:p>
-      <w:pPr>
-        <w:pStyle w:val="ListBullet"/>
-        <w:numPr>
-          <w:ilvl w:val="0"/>
-          <w:numId w:val="0"/>
-        </w:numPr>
-        <w:spacing w:before="20" w:after="40"/>
-        <w:ind w:left="340"/>
-      </w:pPr>
-    </w:p>
-    <w:p>
-      <w:pPr>
         <w:spacing w:before="280" w:after="80"/>
       </w:pPr>
       <w:r>
@@ -17636,7 +17373,6 @@
           <w:b/>
           <w:sz w:val="28"/>
         </w:rPr>
-        <w:lastRenderedPageBreak/>
         <w:t>4.6 Database Schema Design</w:t>
       </w:r>
     </w:p>
@@ -26322,12 +26058,31 @@
     <w:p>
       <w:pPr>
         <w:spacing w:before="280" w:after="80"/>
-      </w:pPr>
-      <w:r>
         <w:rPr>
           <w:b/>
           <w:sz w:val="28"/>
         </w:rPr>
+      </w:pPr>
+    </w:p>
+    <w:p>
+      <w:pPr>
+        <w:spacing w:before="280" w:after="80"/>
+        <w:rPr>
+          <w:b/>
+          <w:sz w:val="28"/>
+        </w:rPr>
+      </w:pPr>
+    </w:p>
+    <w:p>
+      <w:pPr>
+        <w:spacing w:before="280" w:after="80"/>
+      </w:pPr>
+      <w:r>
+        <w:rPr>
+          <w:b/>
+          <w:sz w:val="28"/>
+        </w:rPr>
+        <w:lastRenderedPageBreak/>
         <w:t>7.4 Frontend Build Verification</w:t>
       </w:r>
     </w:p>
@@ -26468,7 +26223,6 @@
               <w:jc w:val="center"/>
             </w:pPr>
             <w:r>
-              <w:lastRenderedPageBreak/>
               <w:t>Modules transformed</w:t>
             </w:r>
           </w:p>

</xml_diff>